<commit_message>
feat(admin): update content editor layout, templates, and script parsers to match styling
</commit_message>
<xml_diff>
--- a/Code/public/templates/autofill_template.docx
+++ b/Code/public/templates/autofill_template.docx
@@ -77,11 +77,11 @@
               </w:rPr>
               <w:t>GUIDELINES:</w:t>
               <w:br/>
-              <w:t>1. A shortcut is a text trigger starting with a semicolon (e.g. ';gord').</w:t>
+              <w:t>1. A shortcut is a text trigger starting with a semicolon (e.g. ;shortcut).</w:t>
               <w:br/>
               <w:t>2. Set the 'System' to group the template under a specific system tab.</w:t>
               <w:br/>
-              <w:t>3. Include text placeholder fields inside brackets like '[Duration]' so they can be easily tabbed through in the consultation editor.</w:t>
+              <w:t>3. Include text placeholder fields inside brackets like [Placeholder] so they can be easily tabbed through in the consultation editor.</w:t>
             </w:r>
           </w:p>
         </w:tc>
@@ -111,7 +111,7 @@
           <w:color w:val="1E293B"/>
           <w:sz w:val="22"/>
         </w:rPr>
-        <w:t>GORD SOAP Template</w:t>
+        <w:t>[Enter Template Name]</w:t>
       </w:r>
       <w:r>
         <w:br/>
@@ -131,7 +131,7 @@
           <w:color w:val="1E293B"/>
           <w:sz w:val="22"/>
         </w:rPr>
-        <w:t>;gord</w:t>
+        <w:t>[Enter Shortcut]</w:t>
       </w:r>
       <w:r>
         <w:br/>
@@ -151,7 +151,7 @@
           <w:color w:val="1E293B"/>
           <w:sz w:val="22"/>
         </w:rPr>
-        <w:t>Gastrointestinal</w:t>
+        <w:t>[Enter Body System]</w:t>
       </w:r>
     </w:p>
     <w:p>
@@ -178,7 +178,7 @@
           <w:color w:val="475569"/>
           <w:sz w:val="21"/>
         </w:rPr>
-        <w:t>Patient presents complaining of retrosternal burning sensation for [Duration]. Worsens after eating heavy meals and when lying flat. Describes [Severity, e.g., mild/moderate] symptoms. Denies dysphagia, weight loss, or haematemesis.</w:t>
+        <w:t>Patient presents for [Reason for Visit]. Describes [Symptom description] lasting for [Duration]. Symptoms are [Severity]. Worsened by [Triggers] and relieved by [Relieving factors]. Denies [Relevant red flag symptoms].</w:t>
       </w:r>
     </w:p>
     <w:p>
@@ -205,7 +205,9 @@
           <w:color w:val="475569"/>
           <w:sz w:val="21"/>
         </w:rPr>
-        <w:t>Abdomen: soft, non-tender. No epigastric tenderness. No guarding or rebound tenderness. Bowel sounds present and normal. No signs of anaemia.</w:t>
+        <w:t>Vitals: BP [Blood Pressure] mmHg, HR [Heart Rate] bpm, Temp [Temperature] °C.</w:t>
+        <w:br/>
+        <w:t>Examination: Abdomen [Findings]. Chest [Findings]. Cardiovascular [Findings]. No signs of [Alarm symptoms].</w:t>
       </w:r>
     </w:p>
     <w:p>
@@ -232,7 +234,7 @@
           <w:color w:val="475569"/>
           <w:sz w:val="21"/>
         </w:rPr>
-        <w:t>Gastro-oesophageal Reflux Disease (GORD). Presentation is typical; no red flags present at this time.</w:t>
+        <w:t>[Diagnosis/Impression]. Controlled/uncontrolled, with [Complications/Comorbidities]. No red flags present at this time.</w:t>
       </w:r>
     </w:p>
     <w:p>
@@ -259,11 +261,13 @@
           <w:color w:val="475569"/>
           <w:sz w:val="21"/>
         </w:rPr>
-        <w:t>1. Lifestyle modification: avoid eating within 3 hours of bed, elevate head of bed, identify dietary triggers.</w:t>
+        <w:t>1. Lifestyle modification: [Recommendations].</w:t>
         <w:br/>
-        <w:t>2. Start Proton Pump Inhibitor trial: Esomeprazole 20mg PO daily for 4-8 weeks.</w:t>
+        <w:t>2. Start Pharmacotherapy: [Medication details].</w:t>
         <w:br/>
-        <w:t>3. Review in [Review time, e.g., 4 weeks]. Advised to return immediately if dysphagia or persistent vomiting develops.</w:t>
+        <w:t>3. Order investigations: [Investigations].</w:t>
+        <w:br/>
+        <w:t>4. Review in [Review time]. Advised to return immediately if [Warning signs] develops.</w:t>
       </w:r>
     </w:p>
     <w:sectPr>

</xml_diff>